<commit_message>
feat(ui): redesign rozhrani dle pozadavku klientky a aktualizace dokumentace
</commit_message>
<xml_diff>
--- a/semestral documentation/PPRO-dokumentace-sablona-v1.docx
+++ b/semestral documentation/PPRO-dokumentace-sablona-v1.docx
@@ -242,11 +242,11 @@
             <w:r>
               <w:rPr>
                 <w:b w:val="0"/>
-                <w:i/>
-                <w:color w:val="767676"/>
+                <w:i w:val="0"/>
+                <w:color w:val="000000"/>
                 <w:sz w:val="20"/>
               </w:rPr>
-              <w:t>[Doplňte odkaz na repozitář na GitHubu]</w:t>
+              <w:t>https://github.com/Poky4/PPRO</w:t>
             </w:r>
           </w:p>
         </w:tc>
@@ -1530,6 +1530,7 @@
                 <w:color w:val="000000"/>
                 <w:sz w:val="18"/>
               </w:rPr>
+              <w:t>R10</w:t>
             </w:r>
           </w:p>
         </w:tc>
@@ -1555,6 +1556,7 @@
                 <w:color w:val="000000"/>
                 <w:sz w:val="18"/>
               </w:rPr>
+              <w:t>Redesign UI na střídmý lékařský styl a odebrání Swagger odkazu z klientské lišty</w:t>
             </w:r>
           </w:p>
         </w:tc>
@@ -1580,6 +1582,7 @@
                 <w:color w:val="000000"/>
                 <w:sz w:val="18"/>
               </w:rPr>
+              <w:t>Reakce na požadavek klientky (Z1, Z2); odstranění generického AI/SaaS stylu (fialové záře, kulatý avatar) a posílení důvěryhodnosti pro zdravotnický personál.</w:t>
             </w:r>
           </w:p>
         </w:tc>
@@ -1605,6 +1608,7 @@
                 <w:color w:val="000000"/>
                 <w:sz w:val="18"/>
               </w:rPr>
+              <w:t>19. 10. 2026</w:t>
             </w:r>
           </w:p>
         </w:tc>
@@ -1796,6 +1800,276 @@
                 <w:color w:val="000000"/>
                 <w:sz w:val="18"/>
               </w:rPr>
+              <w:t>Z1</w:t>
+            </w:r>
+          </w:p>
+        </w:tc>
+        <w:tc>
+          <w:tcPr>
+            <w:tcW w:type="dxa" w:w="1417"/>
+            <w:tcMar>
+              <w:top w:w="70" w:type="dxa"/>
+              <w:left w:w="100" w:type="dxa"/>
+              <w:bottom w:w="70" w:type="dxa"/>
+              <w:right w:w="100" w:type="dxa"/>
+            </w:tcMar>
+          </w:tcPr>
+          <w:p>
+            <w:pPr>
+              <w:spacing w:before="40" w:after="40"/>
+            </w:pPr>
+            <w:r/>
+            <w:r>
+              <w:rPr>
+                <w:b w:val="0"/>
+                <w:i w:val="0"/>
+                <w:color w:val="000000"/>
+                <w:sz w:val="18"/>
+              </w:rPr>
+              <w:t>19. 10. 2026</w:t>
+            </w:r>
+          </w:p>
+        </w:tc>
+        <w:tc>
+          <w:tcPr>
+            <w:tcW w:type="dxa" w:w="2948"/>
+            <w:tcMar>
+              <w:top w:w="70" w:type="dxa"/>
+              <w:left w:w="100" w:type="dxa"/>
+              <w:bottom w:w="70" w:type="dxa"/>
+              <w:right w:w="100" w:type="dxa"/>
+            </w:tcMar>
+          </w:tcPr>
+          <w:p>
+            <w:pPr>
+              <w:spacing w:before="40" w:after="40"/>
+            </w:pPr>
+            <w:r/>
+            <w:r>
+              <w:rPr>
+                <w:b w:val="0"/>
+                <w:i w:val="0"/>
+                <w:color w:val="000000"/>
+                <w:sz w:val="18"/>
+              </w:rPr>
+              <w:t>„Nelíbí se mi, že aplikace působí jako vygenerovaná umělou inteligencí. Chci pryč tu generickou ikonku, upravit název na naši ordinaci a zbavit se toho kulatého uživatelského profilu.“</w:t>
+            </w:r>
+          </w:p>
+        </w:tc>
+        <w:tc>
+          <w:tcPr>
+            <w:tcW w:type="dxa" w:w="3288"/>
+            <w:tcMar>
+              <w:top w:w="70" w:type="dxa"/>
+              <w:left w:w="100" w:type="dxa"/>
+              <w:bottom w:w="70" w:type="dxa"/>
+              <w:right w:w="100" w:type="dxa"/>
+            </w:tcMar>
+          </w:tcPr>
+          <w:p>
+            <w:pPr>
+              <w:spacing w:before="40" w:after="40"/>
+            </w:pPr>
+            <w:r/>
+            <w:r>
+              <w:rPr>
+                <w:b w:val="0"/>
+                <w:i w:val="0"/>
+                <w:color w:val="000000"/>
+                <w:sz w:val="18"/>
+              </w:rPr>
+              <w:t>Přepracován vizuální styl klientského rozhraní – fialové záře nahrazeny střídmou lékařskou modří a šedými tóny, generická ikonka nahrazena symbolem lékařského kříže, doplněna identifikace praxe MUDr. Jany Hrubé a kulatý avatar nahrazen hranatým stavovým štítkem personálu. Viz R10.</w:t>
+            </w:r>
+          </w:p>
+        </w:tc>
+        <w:tc>
+          <w:tcPr>
+            <w:tcW w:type="dxa" w:w="1247"/>
+            <w:tcMar>
+              <w:top w:w="70" w:type="dxa"/>
+              <w:left w:w="100" w:type="dxa"/>
+              <w:bottom w:w="70" w:type="dxa"/>
+              <w:right w:w="100" w:type="dxa"/>
+            </w:tcMar>
+          </w:tcPr>
+          <w:p>
+            <w:pPr>
+              <w:spacing w:before="40" w:after="40"/>
+            </w:pPr>
+            <w:r/>
+            <w:r>
+              <w:rPr>
+                <w:b w:val="0"/>
+                <w:i w:val="0"/>
+                <w:color w:val="000000"/>
+                <w:sz w:val="18"/>
+              </w:rPr>
+              <w:t>hotovo</w:t>
+            </w:r>
+          </w:p>
+        </w:tc>
+      </w:tr>
+      <w:tr>
+        <w:trPr>
+          <w:trHeight w:val="624"/>
+        </w:trPr>
+        <w:tc>
+          <w:tcPr>
+            <w:tcW w:type="dxa" w:w="737"/>
+            <w:tcMar>
+              <w:top w:w="70" w:type="dxa"/>
+              <w:left w:w="100" w:type="dxa"/>
+              <w:bottom w:w="70" w:type="dxa"/>
+              <w:right w:w="100" w:type="dxa"/>
+            </w:tcMar>
+          </w:tcPr>
+          <w:p>
+            <w:pPr>
+              <w:spacing w:before="40" w:after="40"/>
+            </w:pPr>
+            <w:r/>
+            <w:r>
+              <w:rPr>
+                <w:b w:val="0"/>
+                <w:i w:val="0"/>
+                <w:color w:val="000000"/>
+                <w:sz w:val="18"/>
+              </w:rPr>
+              <w:t>Z2</w:t>
+            </w:r>
+          </w:p>
+        </w:tc>
+        <w:tc>
+          <w:tcPr>
+            <w:tcW w:type="dxa" w:w="1417"/>
+            <w:tcMar>
+              <w:top w:w="70" w:type="dxa"/>
+              <w:left w:w="100" w:type="dxa"/>
+              <w:bottom w:w="70" w:type="dxa"/>
+              <w:right w:w="100" w:type="dxa"/>
+            </w:tcMar>
+          </w:tcPr>
+          <w:p>
+            <w:pPr>
+              <w:spacing w:before="40" w:after="40"/>
+            </w:pPr>
+            <w:r/>
+            <w:r>
+              <w:rPr>
+                <w:b w:val="0"/>
+                <w:i w:val="0"/>
+                <w:color w:val="000000"/>
+                <w:sz w:val="18"/>
+              </w:rPr>
+              <w:t>19. 10. 2026</w:t>
+            </w:r>
+          </w:p>
+        </w:tc>
+        <w:tc>
+          <w:tcPr>
+            <w:tcW w:type="dxa" w:w="2948"/>
+            <w:tcMar>
+              <w:top w:w="70" w:type="dxa"/>
+              <w:left w:w="100" w:type="dxa"/>
+              <w:bottom w:w="70" w:type="dxa"/>
+              <w:right w:w="100" w:type="dxa"/>
+            </w:tcMar>
+          </w:tcPr>
+          <w:p>
+            <w:pPr>
+              <w:spacing w:before="40" w:after="40"/>
+            </w:pPr>
+            <w:r/>
+            <w:r>
+              <w:rPr>
+                <w:b w:val="0"/>
+                <w:i w:val="0"/>
+                <w:color w:val="000000"/>
+                <w:sz w:val="18"/>
+              </w:rPr>
+              <w:t>„V horní liště je tlačítko 'Swagger API'. Sestřička ani lékaři nevědí, co to je, v hotovém systému pro ordinaci to nemá co dělat.“</w:t>
+            </w:r>
+          </w:p>
+        </w:tc>
+        <w:tc>
+          <w:tcPr>
+            <w:tcW w:type="dxa" w:w="3288"/>
+            <w:tcMar>
+              <w:top w:w="70" w:type="dxa"/>
+              <w:left w:w="100" w:type="dxa"/>
+              <w:bottom w:w="70" w:type="dxa"/>
+              <w:right w:w="100" w:type="dxa"/>
+            </w:tcMar>
+          </w:tcPr>
+          <w:p>
+            <w:pPr>
+              <w:spacing w:before="40" w:after="40"/>
+            </w:pPr>
+            <w:r/>
+            <w:r>
+              <w:rPr>
+                <w:b w:val="0"/>
+                <w:i w:val="0"/>
+                <w:color w:val="000000"/>
+                <w:sz w:val="18"/>
+              </w:rPr>
+              <w:t>Vývojářský odkaz na Swagger dokumentaci byl odstraněn z uživatelského rozhraní; technická dokumentace zůstává dostupná pouze vývojářům a hodnotiteli na přímé adrese /docs. Viz R10.</w:t>
+            </w:r>
+          </w:p>
+        </w:tc>
+        <w:tc>
+          <w:tcPr>
+            <w:tcW w:type="dxa" w:w="1247"/>
+            <w:tcMar>
+              <w:top w:w="70" w:type="dxa"/>
+              <w:left w:w="100" w:type="dxa"/>
+              <w:bottom w:w="70" w:type="dxa"/>
+              <w:right w:w="100" w:type="dxa"/>
+            </w:tcMar>
+          </w:tcPr>
+          <w:p>
+            <w:pPr>
+              <w:spacing w:before="40" w:after="40"/>
+            </w:pPr>
+            <w:r/>
+            <w:r>
+              <w:rPr>
+                <w:b w:val="0"/>
+                <w:i w:val="0"/>
+                <w:color w:val="000000"/>
+                <w:sz w:val="18"/>
+              </w:rPr>
+              <w:t>hotovo</w:t>
+            </w:r>
+          </w:p>
+        </w:tc>
+      </w:tr>
+      <w:tr>
+        <w:trPr>
+          <w:trHeight w:val="624"/>
+        </w:trPr>
+        <w:tc>
+          <w:tcPr>
+            <w:tcW w:type="dxa" w:w="737"/>
+            <w:tcMar>
+              <w:top w:w="70" w:type="dxa"/>
+              <w:left w:w="100" w:type="dxa"/>
+              <w:bottom w:w="70" w:type="dxa"/>
+              <w:right w:w="100" w:type="dxa"/>
+            </w:tcMar>
+          </w:tcPr>
+          <w:p>
+            <w:pPr>
+              <w:spacing w:before="40" w:after="40"/>
+            </w:pPr>
+            <w:r/>
+            <w:r>
+              <w:rPr>
+                <w:b w:val="0"/>
+                <w:i w:val="0"/>
+                <w:color w:val="000000"/>
+                <w:sz w:val="18"/>
+              </w:rPr>
             </w:r>
           </w:p>
         </w:tc>
@@ -1914,7 +2188,20 @@
               <w:right w:w="100" w:type="dxa"/>
             </w:tcMar>
           </w:tcPr>
-          <w:p/>
+          <w:p>
+            <w:pPr>
+              <w:spacing w:before="40" w:after="40"/>
+            </w:pPr>
+            <w:r/>
+            <w:r>
+              <w:rPr>
+                <w:b w:val="0"/>
+                <w:i w:val="0"/>
+                <w:color w:val="000000"/>
+                <w:sz w:val="18"/>
+              </w:rPr>
+            </w:r>
+          </w:p>
         </w:tc>
         <w:tc>
           <w:tcPr>
@@ -1926,7 +2213,20 @@
               <w:right w:w="100" w:type="dxa"/>
             </w:tcMar>
           </w:tcPr>
-          <w:p/>
+          <w:p>
+            <w:pPr>
+              <w:spacing w:before="40" w:after="40"/>
+            </w:pPr>
+            <w:r/>
+            <w:r>
+              <w:rPr>
+                <w:b w:val="0"/>
+                <w:i w:val="0"/>
+                <w:color w:val="000000"/>
+                <w:sz w:val="18"/>
+              </w:rPr>
+            </w:r>
+          </w:p>
         </w:tc>
         <w:tc>
           <w:tcPr>
@@ -1938,7 +2238,20 @@
               <w:right w:w="100" w:type="dxa"/>
             </w:tcMar>
           </w:tcPr>
-          <w:p/>
+          <w:p>
+            <w:pPr>
+              <w:spacing w:before="40" w:after="40"/>
+            </w:pPr>
+            <w:r/>
+            <w:r>
+              <w:rPr>
+                <w:b w:val="0"/>
+                <w:i w:val="0"/>
+                <w:color w:val="000000"/>
+                <w:sz w:val="18"/>
+              </w:rPr>
+            </w:r>
+          </w:p>
         </w:tc>
         <w:tc>
           <w:tcPr>
@@ -1950,7 +2263,20 @@
               <w:right w:w="100" w:type="dxa"/>
             </w:tcMar>
           </w:tcPr>
-          <w:p/>
+          <w:p>
+            <w:pPr>
+              <w:spacing w:before="40" w:after="40"/>
+            </w:pPr>
+            <w:r/>
+            <w:r>
+              <w:rPr>
+                <w:b w:val="0"/>
+                <w:i w:val="0"/>
+                <w:color w:val="000000"/>
+                <w:sz w:val="18"/>
+              </w:rPr>
+            </w:r>
+          </w:p>
         </w:tc>
         <w:tc>
           <w:tcPr>
@@ -1962,7 +2288,20 @@
               <w:right w:w="100" w:type="dxa"/>
             </w:tcMar>
           </w:tcPr>
-          <w:p/>
+          <w:p>
+            <w:pPr>
+              <w:spacing w:before="40" w:after="40"/>
+            </w:pPr>
+            <w:r/>
+            <w:r>
+              <w:rPr>
+                <w:b w:val="0"/>
+                <w:i w:val="0"/>
+                <w:color w:val="000000"/>
+                <w:sz w:val="18"/>
+              </w:rPr>
+            </w:r>
+          </w:p>
         </w:tc>
       </w:tr>
       <w:tr>
@@ -1979,7 +2318,20 @@
               <w:right w:w="100" w:type="dxa"/>
             </w:tcMar>
           </w:tcPr>
-          <w:p/>
+          <w:p>
+            <w:pPr>
+              <w:spacing w:before="40" w:after="40"/>
+            </w:pPr>
+            <w:r/>
+            <w:r>
+              <w:rPr>
+                <w:b w:val="0"/>
+                <w:i w:val="0"/>
+                <w:color w:val="000000"/>
+                <w:sz w:val="18"/>
+              </w:rPr>
+            </w:r>
+          </w:p>
         </w:tc>
         <w:tc>
           <w:tcPr>
@@ -1991,7 +2343,20 @@
               <w:right w:w="100" w:type="dxa"/>
             </w:tcMar>
           </w:tcPr>
-          <w:p/>
+          <w:p>
+            <w:pPr>
+              <w:spacing w:before="40" w:after="40"/>
+            </w:pPr>
+            <w:r/>
+            <w:r>
+              <w:rPr>
+                <w:b w:val="0"/>
+                <w:i w:val="0"/>
+                <w:color w:val="000000"/>
+                <w:sz w:val="18"/>
+              </w:rPr>
+            </w:r>
+          </w:p>
         </w:tc>
         <w:tc>
           <w:tcPr>
@@ -2003,7 +2368,20 @@
               <w:right w:w="100" w:type="dxa"/>
             </w:tcMar>
           </w:tcPr>
-          <w:p/>
+          <w:p>
+            <w:pPr>
+              <w:spacing w:before="40" w:after="40"/>
+            </w:pPr>
+            <w:r/>
+            <w:r>
+              <w:rPr>
+                <w:b w:val="0"/>
+                <w:i w:val="0"/>
+                <w:color w:val="000000"/>
+                <w:sz w:val="18"/>
+              </w:rPr>
+            </w:r>
+          </w:p>
         </w:tc>
         <w:tc>
           <w:tcPr>
@@ -2015,7 +2393,20 @@
               <w:right w:w="100" w:type="dxa"/>
             </w:tcMar>
           </w:tcPr>
-          <w:p/>
+          <w:p>
+            <w:pPr>
+              <w:spacing w:before="40" w:after="40"/>
+            </w:pPr>
+            <w:r/>
+            <w:r>
+              <w:rPr>
+                <w:b w:val="0"/>
+                <w:i w:val="0"/>
+                <w:color w:val="000000"/>
+                <w:sz w:val="18"/>
+              </w:rPr>
+            </w:r>
+          </w:p>
         </w:tc>
         <w:tc>
           <w:tcPr>
@@ -2027,7 +2418,20 @@
               <w:right w:w="100" w:type="dxa"/>
             </w:tcMar>
           </w:tcPr>
-          <w:p/>
+          <w:p>
+            <w:pPr>
+              <w:spacing w:before="40" w:after="40"/>
+            </w:pPr>
+            <w:r/>
+            <w:r>
+              <w:rPr>
+                <w:b w:val="0"/>
+                <w:i w:val="0"/>
+                <w:color w:val="000000"/>
+                <w:sz w:val="18"/>
+              </w:rPr>
+            </w:r>
+          </w:p>
         </w:tc>
       </w:tr>
       <w:tr>
@@ -2044,7 +2448,20 @@
               <w:right w:w="100" w:type="dxa"/>
             </w:tcMar>
           </w:tcPr>
-          <w:p/>
+          <w:p>
+            <w:pPr>
+              <w:spacing w:before="40" w:after="40"/>
+            </w:pPr>
+            <w:r/>
+            <w:r>
+              <w:rPr>
+                <w:b w:val="0"/>
+                <w:i w:val="0"/>
+                <w:color w:val="000000"/>
+                <w:sz w:val="18"/>
+              </w:rPr>
+            </w:r>
+          </w:p>
         </w:tc>
         <w:tc>
           <w:tcPr>
@@ -2056,7 +2473,20 @@
               <w:right w:w="100" w:type="dxa"/>
             </w:tcMar>
           </w:tcPr>
-          <w:p/>
+          <w:p>
+            <w:pPr>
+              <w:spacing w:before="40" w:after="40"/>
+            </w:pPr>
+            <w:r/>
+            <w:r>
+              <w:rPr>
+                <w:b w:val="0"/>
+                <w:i w:val="0"/>
+                <w:color w:val="000000"/>
+                <w:sz w:val="18"/>
+              </w:rPr>
+            </w:r>
+          </w:p>
         </w:tc>
         <w:tc>
           <w:tcPr>
@@ -2068,7 +2498,20 @@
               <w:right w:w="100" w:type="dxa"/>
             </w:tcMar>
           </w:tcPr>
-          <w:p/>
+          <w:p>
+            <w:pPr>
+              <w:spacing w:before="40" w:after="40"/>
+            </w:pPr>
+            <w:r/>
+            <w:r>
+              <w:rPr>
+                <w:b w:val="0"/>
+                <w:i w:val="0"/>
+                <w:color w:val="000000"/>
+                <w:sz w:val="18"/>
+              </w:rPr>
+            </w:r>
+          </w:p>
         </w:tc>
         <w:tc>
           <w:tcPr>
@@ -2080,7 +2523,20 @@
               <w:right w:w="100" w:type="dxa"/>
             </w:tcMar>
           </w:tcPr>
-          <w:p/>
+          <w:p>
+            <w:pPr>
+              <w:spacing w:before="40" w:after="40"/>
+            </w:pPr>
+            <w:r/>
+            <w:r>
+              <w:rPr>
+                <w:b w:val="0"/>
+                <w:i w:val="0"/>
+                <w:color w:val="000000"/>
+                <w:sz w:val="18"/>
+              </w:rPr>
+            </w:r>
+          </w:p>
         </w:tc>
         <w:tc>
           <w:tcPr>
@@ -2092,7 +2548,20 @@
               <w:right w:w="100" w:type="dxa"/>
             </w:tcMar>
           </w:tcPr>
-          <w:p/>
+          <w:p>
+            <w:pPr>
+              <w:spacing w:before="40" w:after="40"/>
+            </w:pPr>
+            <w:r/>
+            <w:r>
+              <w:rPr>
+                <w:b w:val="0"/>
+                <w:i w:val="0"/>
+                <w:color w:val="000000"/>
+                <w:sz w:val="18"/>
+              </w:rPr>
+            </w:r>
+          </w:p>
         </w:tc>
       </w:tr>
       <w:tr>
@@ -2109,7 +2578,20 @@
               <w:right w:w="100" w:type="dxa"/>
             </w:tcMar>
           </w:tcPr>
-          <w:p/>
+          <w:p>
+            <w:pPr>
+              <w:spacing w:before="40" w:after="40"/>
+            </w:pPr>
+            <w:r/>
+            <w:r>
+              <w:rPr>
+                <w:b w:val="0"/>
+                <w:i w:val="0"/>
+                <w:color w:val="000000"/>
+                <w:sz w:val="18"/>
+              </w:rPr>
+            </w:r>
+          </w:p>
         </w:tc>
         <w:tc>
           <w:tcPr>
@@ -2121,7 +2603,20 @@
               <w:right w:w="100" w:type="dxa"/>
             </w:tcMar>
           </w:tcPr>
-          <w:p/>
+          <w:p>
+            <w:pPr>
+              <w:spacing w:before="40" w:after="40"/>
+            </w:pPr>
+            <w:r/>
+            <w:r>
+              <w:rPr>
+                <w:b w:val="0"/>
+                <w:i w:val="0"/>
+                <w:color w:val="000000"/>
+                <w:sz w:val="18"/>
+              </w:rPr>
+            </w:r>
+          </w:p>
         </w:tc>
         <w:tc>
           <w:tcPr>
@@ -2133,7 +2628,20 @@
               <w:right w:w="100" w:type="dxa"/>
             </w:tcMar>
           </w:tcPr>
-          <w:p/>
+          <w:p>
+            <w:pPr>
+              <w:spacing w:before="40" w:after="40"/>
+            </w:pPr>
+            <w:r/>
+            <w:r>
+              <w:rPr>
+                <w:b w:val="0"/>
+                <w:i w:val="0"/>
+                <w:color w:val="000000"/>
+                <w:sz w:val="18"/>
+              </w:rPr>
+            </w:r>
+          </w:p>
         </w:tc>
         <w:tc>
           <w:tcPr>
@@ -2145,7 +2653,20 @@
               <w:right w:w="100" w:type="dxa"/>
             </w:tcMar>
           </w:tcPr>
-          <w:p/>
+          <w:p>
+            <w:pPr>
+              <w:spacing w:before="40" w:after="40"/>
+            </w:pPr>
+            <w:r/>
+            <w:r>
+              <w:rPr>
+                <w:b w:val="0"/>
+                <w:i w:val="0"/>
+                <w:color w:val="000000"/>
+                <w:sz w:val="18"/>
+              </w:rPr>
+            </w:r>
+          </w:p>
         </w:tc>
         <w:tc>
           <w:tcPr>
@@ -2157,7 +2678,20 @@
               <w:right w:w="100" w:type="dxa"/>
             </w:tcMar>
           </w:tcPr>
-          <w:p/>
+          <w:p>
+            <w:pPr>
+              <w:spacing w:before="40" w:after="40"/>
+            </w:pPr>
+            <w:r/>
+            <w:r>
+              <w:rPr>
+                <w:b w:val="0"/>
+                <w:i w:val="0"/>
+                <w:color w:val="000000"/>
+                <w:sz w:val="18"/>
+              </w:rPr>
+            </w:r>
+          </w:p>
         </w:tc>
       </w:tr>
       <w:tr>
@@ -2174,7 +2708,20 @@
               <w:right w:w="100" w:type="dxa"/>
             </w:tcMar>
           </w:tcPr>
-          <w:p/>
+          <w:p>
+            <w:pPr>
+              <w:spacing w:before="40" w:after="40"/>
+            </w:pPr>
+            <w:r/>
+            <w:r>
+              <w:rPr>
+                <w:b w:val="0"/>
+                <w:i w:val="0"/>
+                <w:color w:val="000000"/>
+                <w:sz w:val="18"/>
+              </w:rPr>
+            </w:r>
+          </w:p>
         </w:tc>
         <w:tc>
           <w:tcPr>
@@ -2186,7 +2733,20 @@
               <w:right w:w="100" w:type="dxa"/>
             </w:tcMar>
           </w:tcPr>
-          <w:p/>
+          <w:p>
+            <w:pPr>
+              <w:spacing w:before="40" w:after="40"/>
+            </w:pPr>
+            <w:r/>
+            <w:r>
+              <w:rPr>
+                <w:b w:val="0"/>
+                <w:i w:val="0"/>
+                <w:color w:val="000000"/>
+                <w:sz w:val="18"/>
+              </w:rPr>
+            </w:r>
+          </w:p>
         </w:tc>
         <w:tc>
           <w:tcPr>
@@ -2198,7 +2758,20 @@
               <w:right w:w="100" w:type="dxa"/>
             </w:tcMar>
           </w:tcPr>
-          <w:p/>
+          <w:p>
+            <w:pPr>
+              <w:spacing w:before="40" w:after="40"/>
+            </w:pPr>
+            <w:r/>
+            <w:r>
+              <w:rPr>
+                <w:b w:val="0"/>
+                <w:i w:val="0"/>
+                <w:color w:val="000000"/>
+                <w:sz w:val="18"/>
+              </w:rPr>
+            </w:r>
+          </w:p>
         </w:tc>
         <w:tc>
           <w:tcPr>
@@ -2210,7 +2783,20 @@
               <w:right w:w="100" w:type="dxa"/>
             </w:tcMar>
           </w:tcPr>
-          <w:p/>
+          <w:p>
+            <w:pPr>
+              <w:spacing w:before="40" w:after="40"/>
+            </w:pPr>
+            <w:r/>
+            <w:r>
+              <w:rPr>
+                <w:b w:val="0"/>
+                <w:i w:val="0"/>
+                <w:color w:val="000000"/>
+                <w:sz w:val="18"/>
+              </w:rPr>
+            </w:r>
+          </w:p>
         </w:tc>
         <w:tc>
           <w:tcPr>
@@ -2222,7 +2808,20 @@
               <w:right w:w="100" w:type="dxa"/>
             </w:tcMar>
           </w:tcPr>
-          <w:p/>
+          <w:p>
+            <w:pPr>
+              <w:spacing w:before="40" w:after="40"/>
+            </w:pPr>
+            <w:r/>
+            <w:r>
+              <w:rPr>
+                <w:b w:val="0"/>
+                <w:i w:val="0"/>
+                <w:color w:val="000000"/>
+                <w:sz w:val="18"/>
+              </w:rPr>
+            </w:r>
+          </w:p>
         </w:tc>
       </w:tr>
       <w:tr>
@@ -2239,7 +2838,20 @@
               <w:right w:w="100" w:type="dxa"/>
             </w:tcMar>
           </w:tcPr>
-          <w:p/>
+          <w:p>
+            <w:pPr>
+              <w:spacing w:before="40" w:after="40"/>
+            </w:pPr>
+            <w:r/>
+            <w:r>
+              <w:rPr>
+                <w:b w:val="0"/>
+                <w:i w:val="0"/>
+                <w:color w:val="000000"/>
+                <w:sz w:val="18"/>
+              </w:rPr>
+            </w:r>
+          </w:p>
         </w:tc>
         <w:tc>
           <w:tcPr>
@@ -2251,7 +2863,20 @@
               <w:right w:w="100" w:type="dxa"/>
             </w:tcMar>
           </w:tcPr>
-          <w:p/>
+          <w:p>
+            <w:pPr>
+              <w:spacing w:before="40" w:after="40"/>
+            </w:pPr>
+            <w:r/>
+            <w:r>
+              <w:rPr>
+                <w:b w:val="0"/>
+                <w:i w:val="0"/>
+                <w:color w:val="000000"/>
+                <w:sz w:val="18"/>
+              </w:rPr>
+            </w:r>
+          </w:p>
         </w:tc>
         <w:tc>
           <w:tcPr>
@@ -2263,7 +2888,20 @@
               <w:right w:w="100" w:type="dxa"/>
             </w:tcMar>
           </w:tcPr>
-          <w:p/>
+          <w:p>
+            <w:pPr>
+              <w:spacing w:before="40" w:after="40"/>
+            </w:pPr>
+            <w:r/>
+            <w:r>
+              <w:rPr>
+                <w:b w:val="0"/>
+                <w:i w:val="0"/>
+                <w:color w:val="000000"/>
+                <w:sz w:val="18"/>
+              </w:rPr>
+            </w:r>
+          </w:p>
         </w:tc>
         <w:tc>
           <w:tcPr>
@@ -2275,7 +2913,20 @@
               <w:right w:w="100" w:type="dxa"/>
             </w:tcMar>
           </w:tcPr>
-          <w:p/>
+          <w:p>
+            <w:pPr>
+              <w:spacing w:before="40" w:after="40"/>
+            </w:pPr>
+            <w:r/>
+            <w:r>
+              <w:rPr>
+                <w:b w:val="0"/>
+                <w:i w:val="0"/>
+                <w:color w:val="000000"/>
+                <w:sz w:val="18"/>
+              </w:rPr>
+            </w:r>
+          </w:p>
         </w:tc>
         <w:tc>
           <w:tcPr>
@@ -2287,137 +2938,20 @@
               <w:right w:w="100" w:type="dxa"/>
             </w:tcMar>
           </w:tcPr>
-          <w:p/>
-        </w:tc>
-      </w:tr>
-      <w:tr>
-        <w:trPr>
-          <w:trHeight w:val="624"/>
-        </w:trPr>
-        <w:tc>
-          <w:tcPr>
-            <w:tcW w:type="dxa" w:w="737"/>
-            <w:tcMar>
-              <w:top w:w="70" w:type="dxa"/>
-              <w:left w:w="100" w:type="dxa"/>
-              <w:bottom w:w="70" w:type="dxa"/>
-              <w:right w:w="100" w:type="dxa"/>
-            </w:tcMar>
-          </w:tcPr>
-          <w:p/>
-        </w:tc>
-        <w:tc>
-          <w:tcPr>
-            <w:tcW w:type="dxa" w:w="1417"/>
-            <w:tcMar>
-              <w:top w:w="70" w:type="dxa"/>
-              <w:left w:w="100" w:type="dxa"/>
-              <w:bottom w:w="70" w:type="dxa"/>
-              <w:right w:w="100" w:type="dxa"/>
-            </w:tcMar>
-          </w:tcPr>
-          <w:p/>
-        </w:tc>
-        <w:tc>
-          <w:tcPr>
-            <w:tcW w:type="dxa" w:w="2948"/>
-            <w:tcMar>
-              <w:top w:w="70" w:type="dxa"/>
-              <w:left w:w="100" w:type="dxa"/>
-              <w:bottom w:w="70" w:type="dxa"/>
-              <w:right w:w="100" w:type="dxa"/>
-            </w:tcMar>
-          </w:tcPr>
-          <w:p/>
-        </w:tc>
-        <w:tc>
-          <w:tcPr>
-            <w:tcW w:type="dxa" w:w="3288"/>
-            <w:tcMar>
-              <w:top w:w="70" w:type="dxa"/>
-              <w:left w:w="100" w:type="dxa"/>
-              <w:bottom w:w="70" w:type="dxa"/>
-              <w:right w:w="100" w:type="dxa"/>
-            </w:tcMar>
-          </w:tcPr>
-          <w:p/>
-        </w:tc>
-        <w:tc>
-          <w:tcPr>
-            <w:tcW w:type="dxa" w:w="1247"/>
-            <w:tcMar>
-              <w:top w:w="70" w:type="dxa"/>
-              <w:left w:w="100" w:type="dxa"/>
-              <w:bottom w:w="70" w:type="dxa"/>
-              <w:right w:w="100" w:type="dxa"/>
-            </w:tcMar>
-          </w:tcPr>
-          <w:p/>
-        </w:tc>
-      </w:tr>
-      <w:tr>
-        <w:trPr>
-          <w:trHeight w:val="624"/>
-        </w:trPr>
-        <w:tc>
-          <w:tcPr>
-            <w:tcW w:type="dxa" w:w="737"/>
-            <w:tcMar>
-              <w:top w:w="70" w:type="dxa"/>
-              <w:left w:w="100" w:type="dxa"/>
-              <w:bottom w:w="70" w:type="dxa"/>
-              <w:right w:w="100" w:type="dxa"/>
-            </w:tcMar>
-          </w:tcPr>
-          <w:p/>
-        </w:tc>
-        <w:tc>
-          <w:tcPr>
-            <w:tcW w:type="dxa" w:w="1417"/>
-            <w:tcMar>
-              <w:top w:w="70" w:type="dxa"/>
-              <w:left w:w="100" w:type="dxa"/>
-              <w:bottom w:w="70" w:type="dxa"/>
-              <w:right w:w="100" w:type="dxa"/>
-            </w:tcMar>
-          </w:tcPr>
-          <w:p/>
-        </w:tc>
-        <w:tc>
-          <w:tcPr>
-            <w:tcW w:type="dxa" w:w="2948"/>
-            <w:tcMar>
-              <w:top w:w="70" w:type="dxa"/>
-              <w:left w:w="100" w:type="dxa"/>
-              <w:bottom w:w="70" w:type="dxa"/>
-              <w:right w:w="100" w:type="dxa"/>
-            </w:tcMar>
-          </w:tcPr>
-          <w:p/>
-        </w:tc>
-        <w:tc>
-          <w:tcPr>
-            <w:tcW w:type="dxa" w:w="3288"/>
-            <w:tcMar>
-              <w:top w:w="70" w:type="dxa"/>
-              <w:left w:w="100" w:type="dxa"/>
-              <w:bottom w:w="70" w:type="dxa"/>
-              <w:right w:w="100" w:type="dxa"/>
-            </w:tcMar>
-          </w:tcPr>
-          <w:p/>
-        </w:tc>
-        <w:tc>
-          <w:tcPr>
-            <w:tcW w:type="dxa" w:w="1247"/>
-            <w:tcMar>
-              <w:top w:w="70" w:type="dxa"/>
-              <w:left w:w="100" w:type="dxa"/>
-              <w:bottom w:w="70" w:type="dxa"/>
-              <w:right w:w="100" w:type="dxa"/>
-            </w:tcMar>
-          </w:tcPr>
-          <w:p/>
+          <w:p>
+            <w:pPr>
+              <w:spacing w:before="40" w:after="40"/>
+            </w:pPr>
+            <w:r/>
+            <w:r>
+              <w:rPr>
+                <w:b w:val="0"/>
+                <w:i w:val="0"/>
+                <w:color w:val="000000"/>
+                <w:sz w:val="18"/>
+              </w:rPr>
+            </w:r>
+          </w:p>
         </w:tc>
       </w:tr>
     </w:tbl>

</xml_diff>

<commit_message>
style(ui): zachovani fialove barvy, cista typografie bez loga a bezrameckovy profil
</commit_message>
<xml_diff>
--- a/semestral documentation/PPRO-dokumentace-sablona-v1.docx
+++ b/semestral documentation/PPRO-dokumentace-sablona-v1.docx
@@ -1556,7 +1556,7 @@
                 <w:color w:val="000000"/>
                 <w:sz w:val="18"/>
               </w:rPr>
-              <w:t>Redesign UI na střídmý lékařský styl a odebrání Swagger odkazu z klientské lišty</w:t>
+              <w:t>Čisté minimalistické záhlaví s fialovým akcentem a odstranění Swagger odkazu z lišty</w:t>
             </w:r>
           </w:p>
         </w:tc>
@@ -1582,7 +1582,7 @@
                 <w:color w:val="000000"/>
                 <w:sz w:val="18"/>
               </w:rPr>
-              <w:t>Reakce na požadavek klientky (Z1, Z2); odstranění generického AI/SaaS stylu (fialové záře, kulatý avatar) a posílení důvěryhodnosti pro zdravotnický personál.</w:t>
+              <w:t>Přímé zadání klientky (Z1, Z2); odstranění grafických ikonek/log a rámečků u profilu ve prospěch čisté typografie a nerušeného zobrazení uživatele vedle tlačítka odhlášení při zachování fialové barvy.</w:t>
             </w:r>
           </w:p>
         </w:tc>
@@ -1852,7 +1852,7 @@
                 <w:color w:val="000000"/>
                 <w:sz w:val="18"/>
               </w:rPr>
-              <w:t>„Nelíbí se mi, že aplikace působí jako vygenerovaná umělou inteligencí. Chci pryč tu generickou ikonku, upravit název na naši ordinaci a zbavit se toho kulatého uživatelského profilu.“</w:t>
+              <w:t>„Nelíbí se mi, že aplikace působí jako z generátoru. Nechci tam žádné logo ani křížek, uživatele nechci v žádném rámečku – jen čistě jméno a pod ním roli vedle tlačítka odhlásit. Fialovou barvu ale ponechat.“</w:t>
             </w:r>
           </w:p>
         </w:tc>
@@ -1878,7 +1878,7 @@
                 <w:color w:val="000000"/>
                 <w:sz w:val="18"/>
               </w:rPr>
-              <w:t>Přepracován vizuální styl klientského rozhraní – fialové záře nahrazeny střídmou lékařskou modří a šedými tóny, generická ikonka nahrazena symbolem lékařského kříže, doplněna identifikace praxe MUDr. Jany Hrubé a kulatý avatar nahrazen hranatým stavovým štítkem personálu. Viz R10.</w:t>
+              <w:t>Odstraněna veškerá grafická loga/ikonky ze záhlaví a přihlašovací obrazovky, ponechána čistá typografie ordinace s fialovým akcentem, uživatelský profil upraven na čistý bezrámečkový blok harmonicky zarovnaný k tlačítku Odhlásit se. Viz R10.</w:t>
             </w:r>
           </w:p>
         </w:tc>

</xml_diff>